<commit_message>
data: switch to authentic UCI processed.cleveland.data; retrain (ROC-AUC 0.97) and refresh EDA, report, and metadata
</commit_message>
<xml_diff>
--- a/report/MLOps_Assignment01_Report.docx
+++ b/report/MLOps_Assignment01_Report.docx
@@ -200,7 +200,7 @@
           <w:sz w:val="22"/>
           <w:szCs w:val="22"/>
         </w:rPr>
-        <w:t xml:space="preserve">Heart Disease UCI dataset (Cleveland processed subset): 303 records, 13 features, and a binary target (presence/absence of heart disease). After cleaning, 302 records remain; the classes are mildly imbalanced (~54% positive).</w:t>
+        <w:t xml:space="preserve">Heart Disease UCI dataset (Cleveland processed subset), obtained directly from the UCI Machine Learning Repository (dataset 45): 303 records, 13 features, and a binary target (presence/absence of heart disease). The raw target is 0-4 (severity) and is binarised to 0/1. The classes are close to balanced (~54% negative / 46% positive), with 6 genuine missing values (marked '?') handled by pipeline imputation.</w:t>
       </w:r>
     </w:p>
     <w:p>
@@ -309,7 +309,7 @@
           <w:sz w:val="22"/>
           <w:szCs w:val="22"/>
         </w:rPr>
-        <w:t xml:space="preserve">Data is fetched by src/download_data.py, which targets the canonical UCI repository with a stable mirror fallback and writes data/heart_disease_raw.csv. Cleaning is deterministic and applied before any train/test split:</w:t>
+        <w:t xml:space="preserve">Data is obtained via src/download_data.py, which reads the authentic UCI processed.cleveland.data (falling back to a live download if absent) and writes data/heart_disease_raw.csv. Cleaning is deterministic and applied before any train/test split:</w:t>
       </w:r>
     </w:p>
     <w:p>
@@ -326,7 +326,7 @@
           <w:sz w:val="22"/>
           <w:szCs w:val="22"/>
         </w:rPr>
-        <w:t xml:space="preserve">Invalid encoding artifacts (ca == 4, thal == 0) are coerced to missing for later imputation.</w:t>
+        <w:t xml:space="preserve">Genuine missing values (marked '?' in the source, 6 in total across ca and thal) are converted to NaN for later imputation.</w:t>
       </w:r>
     </w:p>
     <w:p>
@@ -343,7 +343,7 @@
           <w:sz w:val="22"/>
           <w:szCs w:val="22"/>
         </w:rPr>
-        <w:t xml:space="preserve">Exact duplicate rows are dropped (one found).</w:t>
+        <w:t xml:space="preserve">A defensive check coerces any out-of-range encoding artifacts to missing (none present in the authentic Cleveland file).</w:t>
       </w:r>
     </w:p>
     <w:p>
@@ -431,7 +431,7 @@
           <w:sz w:val="18"/>
           <w:szCs w:val="18"/>
         </w:rPr>
-        <w:t xml:space="preserve">Figure 2. Target class distribution — mildly imbalanced (~54% positive).</w:t>
+        <w:t xml:space="preserve">Figure 2. Target class distribution — close to balanced (~54% no-disease, 46% disease).</w:t>
       </w:r>
     </w:p>
     <w:p>
@@ -443,7 +443,7 @@
           <w:sz w:val="22"/>
           <w:szCs w:val="22"/>
         </w:rPr>
-        <w:t xml:space="preserve">Because the imbalance is mild, accuracy is not badly misleading, but precision, recall and ROC-AUC are still reported. In a clinical screening context, recall (catching true cases) is prioritised.</w:t>
+        <w:t xml:space="preserve">Because the classes are near-balanced, accuracy is reasonably reliable, but precision, recall and ROC-AUC are still reported. In a clinical screening context, recall (catching true cases) is prioritised.</w:t>
       </w:r>
     </w:p>
     <w:p>
@@ -889,7 +889,7 @@
                 <w:sz w:val="20"/>
                 <w:szCs w:val="20"/>
               </w:rPr>
-              <w:t xml:space="preserve">0.820</w:t>
+              <w:t xml:space="preserve">0.885</w:t>
             </w:r>
           </w:p>
         </w:tc>
@@ -912,7 +912,7 @@
                 <w:sz w:val="20"/>
                 <w:szCs w:val="20"/>
               </w:rPr>
-              <w:t xml:space="preserve">0.824</w:t>
+              <w:t xml:space="preserve">0.839</w:t>
             </w:r>
           </w:p>
         </w:tc>
@@ -935,7 +935,7 @@
                 <w:sz w:val="20"/>
                 <w:szCs w:val="20"/>
               </w:rPr>
-              <w:t xml:space="preserve">0.848</w:t>
+              <w:t xml:space="preserve">0.929</w:t>
             </w:r>
           </w:p>
         </w:tc>
@@ -958,7 +958,7 @@
                 <w:sz w:val="20"/>
                 <w:szCs w:val="20"/>
               </w:rPr>
-              <w:t xml:space="preserve">0.836</w:t>
+              <w:t xml:space="preserve">0.881</w:t>
             </w:r>
           </w:p>
         </w:tc>
@@ -981,7 +981,7 @@
                 <w:sz w:val="20"/>
                 <w:szCs w:val="20"/>
               </w:rPr>
-              <w:t xml:space="preserve">0.894</w:t>
+              <w:t xml:space="preserve">0.968</w:t>
             </w:r>
           </w:p>
         </w:tc>
@@ -1029,7 +1029,7 @@
                 <w:sz w:val="20"/>
                 <w:szCs w:val="20"/>
               </w:rPr>
-              <w:t xml:space="preserve">0.770</w:t>
+              <w:t xml:space="preserve">0.885</w:t>
             </w:r>
           </w:p>
         </w:tc>
@@ -1052,7 +1052,7 @@
                 <w:sz w:val="20"/>
                 <w:szCs w:val="20"/>
               </w:rPr>
-              <w:t xml:space="preserve">0.744</w:t>
+              <w:t xml:space="preserve">0.839</w:t>
             </w:r>
           </w:p>
         </w:tc>
@@ -1075,7 +1075,7 @@
                 <w:sz w:val="20"/>
                 <w:szCs w:val="20"/>
               </w:rPr>
-              <w:t xml:space="preserve">0.879</w:t>
+              <w:t xml:space="preserve">0.929</w:t>
             </w:r>
           </w:p>
         </w:tc>
@@ -1098,7 +1098,7 @@
                 <w:sz w:val="20"/>
                 <w:szCs w:val="20"/>
               </w:rPr>
-              <w:t xml:space="preserve">0.806</w:t>
+              <w:t xml:space="preserve">0.881</w:t>
             </w:r>
           </w:p>
         </w:tc>
@@ -1121,7 +1121,7 @@
                 <w:sz w:val="20"/>
                 <w:szCs w:val="20"/>
               </w:rPr>
-              <w:t xml:space="preserve">0.893</w:t>
+              <w:t xml:space="preserve">0.950</w:t>
             </w:r>
           </w:p>
         </w:tc>
@@ -1141,7 +1141,7 @@
           <w:sz w:val="22"/>
           <w:szCs w:val="22"/>
         </w:rPr>
-        <w:t xml:space="preserve">Logistic Regression was selected on ROC-AUC and accuracy; its tuning independently chose class_weight='balanced', directly addressing the imbalance. Random Forest achieved higher recall (0.879), a defensible alternative when minimising missed cases matters most.</w:t>
+        <w:t xml:space="preserve">Both models reach identical test-set classification metrics; Logistic Regression is selected on the higher ROC-AUC (0.968 vs 0.950) and its simpler, interpretable form. Recall of 0.93 is strong — important for a screening use case where missing a true case is costly.</w:t>
       </w:r>
     </w:p>
     <w:p>
@@ -2447,7 +2447,7 @@
           <w:sz w:val="22"/>
           <w:szCs w:val="22"/>
         </w:rPr>
-        <w:t xml:space="preserve">The delivered system demonstrates a complete MLOps lifecycle: from a reproducible data pipeline and tracked experimentation, through automated testing and containerised serving, to Kubernetes deployment and live monitoring. The selected Logistic Regression model achieves 0.89 ROC-AUC with balanced precision and recall, and the surrounding engineering ensures the model can be retrained, validated, deployed, and observed reliably.</w:t>
+        <w:t xml:space="preserve">The delivered system demonstrates a complete MLOps lifecycle: from a reproducible data pipeline and tracked experimentation, through automated testing and containerised serving, to Kubernetes deployment and live monitoring. The selected Logistic Regression model achieves 0.97 ROC-AUC with strong precision and recall, and the surrounding engineering ensures the model can be retrained, validated, deployed, and observed reliably.</w:t>
       </w:r>
     </w:p>
     <w:p>

</xml_diff>